<commit_message>
Adding formatted git log on main page, as table, including the possibility of controlling to restrict to the last N logs.
</commit_message>
<xml_diff>
--- a/reports/dynamic_report.docx
+++ b/reports/dynamic_report.docx
@@ -12,7 +12,15 @@
     </w:p>
     <w:p>
       <w:r>
-        <w:t>Report generated on: 2026-02-20 15:04:37</w:t>
+        <w:t>Generated on: 2026-02-20 15:49:10</w:t>
+      </w:r>
+    </w:p>
+    <w:p>
+      <w:pPr>
+        <w:pStyle w:val="Heading1"/>
+      </w:pPr>
+      <w:r>
+        <w:t>System Information</w:t>
       </w:r>
     </w:p>
     <w:p>
@@ -55,12 +63,186 @@
         <w:pStyle w:val="Heading1"/>
       </w:pPr>
       <w:r>
+        <w:t>Git Repository Log</w:t>
+      </w:r>
+    </w:p>
+    <w:p>
+      <w:r>
+        <w:t>This section contains the document versioning log, captured from github. All entries are up to date.</w:t>
+      </w:r>
+    </w:p>
+    <w:p>
+      <w:pPr>
+        <w:pStyle w:val="Heading2"/>
+      </w:pPr>
+      <w:r>
+        <w:t>Last 100 commits from repository '../'</w:t>
+      </w:r>
+    </w:p>
+    <w:tbl>
+      <w:tblPr>
+        <w:tblStyle w:val="TableGrid"/>
+        <w:tblW w:type="auto" w:w="0"/>
+        <w:tblLook w:firstColumn="1" w:firstRow="1" w:lastColumn="0" w:lastRow="0" w:noHBand="0" w:noVBand="1" w:val="04A0"/>
+      </w:tblPr>
+      <w:tblGrid>
+        <w:gridCol w:w="2160"/>
+        <w:gridCol w:w="2160"/>
+        <w:gridCol w:w="2160"/>
+        <w:gridCol w:w="2160"/>
+      </w:tblGrid>
+      <w:tr>
+        <w:tc>
+          <w:tcPr>
+            <w:tcW w:type="dxa" w:w="2160"/>
+          </w:tcPr>
+          <w:p>
+            <w:r>
+              <w:t>Commit Hash</w:t>
+            </w:r>
+          </w:p>
+        </w:tc>
+        <w:tc>
+          <w:tcPr>
+            <w:tcW w:type="dxa" w:w="2160"/>
+          </w:tcPr>
+          <w:p>
+            <w:r>
+              <w:t>Author</w:t>
+            </w:r>
+          </w:p>
+        </w:tc>
+        <w:tc>
+          <w:tcPr>
+            <w:tcW w:type="dxa" w:w="2160"/>
+          </w:tcPr>
+          <w:p>
+            <w:r>
+              <w:t>Date</w:t>
+            </w:r>
+          </w:p>
+        </w:tc>
+        <w:tc>
+          <w:tcPr>
+            <w:tcW w:type="dxa" w:w="2160"/>
+          </w:tcPr>
+          <w:p>
+            <w:r>
+              <w:t>Message</w:t>
+            </w:r>
+          </w:p>
+        </w:tc>
+      </w:tr>
+      <w:tr>
+        <w:tc>
+          <w:tcPr>
+            <w:tcW w:type="dxa" w:w="2160"/>
+          </w:tcPr>
+          <w:p>
+            <w:r>
+              <w:t>017cc1f</w:t>
+            </w:r>
+          </w:p>
+        </w:tc>
+        <w:tc>
+          <w:tcPr>
+            <w:tcW w:type="dxa" w:w="2160"/>
+          </w:tcPr>
+          <w:p>
+            <w:r>
+              <w:t>Marco Miani</w:t>
+            </w:r>
+          </w:p>
+        </w:tc>
+        <w:tc>
+          <w:tcPr>
+            <w:tcW w:type="dxa" w:w="2160"/>
+          </w:tcPr>
+          <w:p>
+            <w:r>
+              <w:t>Fri Feb 20 15:06:01 2026 +0200</w:t>
+            </w:r>
+          </w:p>
+        </w:tc>
+        <w:tc>
+          <w:tcPr>
+            <w:tcW w:type="dxa" w:w="2160"/>
+          </w:tcPr>
+          <w:p>
+            <w:r>
+              <w:t>First commit, adding code and output folder</w:t>
+            </w:r>
+          </w:p>
+        </w:tc>
+      </w:tr>
+      <w:tr>
+        <w:tc>
+          <w:tcPr>
+            <w:tcW w:type="dxa" w:w="2160"/>
+          </w:tcPr>
+          <w:p>
+            <w:r>
+              <w:t>cae1622</w:t>
+            </w:r>
+          </w:p>
+        </w:tc>
+        <w:tc>
+          <w:tcPr>
+            <w:tcW w:type="dxa" w:w="2160"/>
+          </w:tcPr>
+          <w:p>
+            <w:r>
+              <w:t>GEA Computing</w:t>
+            </w:r>
+          </w:p>
+        </w:tc>
+        <w:tc>
+          <w:tcPr>
+            <w:tcW w:type="dxa" w:w="2160"/>
+          </w:tcPr>
+          <w:p>
+            <w:r>
+              <w:t>Fri Feb 20 15:00:08 2026 +0200</w:t>
+            </w:r>
+          </w:p>
+        </w:tc>
+        <w:tc>
+          <w:tcPr>
+            <w:tcW w:type="dxa" w:w="2160"/>
+          </w:tcPr>
+          <w:p>
+            <w:r>
+              <w:t>Initial commit</w:t>
+            </w:r>
+          </w:p>
+        </w:tc>
+      </w:tr>
+    </w:tbl>
+    <w:p>
+      <w:pPr>
+        <w:pStyle w:val="Caption"/>
+        <w:jc w:val="center"/>
+      </w:pPr>
+      <w:r>
+        <w:t>Table 1: Last 100 commits in repository '../'</w:t>
+      </w:r>
+    </w:p>
+    <w:p>
+      <w:r>
+        <w:br w:type="page"/>
+      </w:r>
+    </w:p>
+    <w:p>
+      <w:pPr>
+        <w:pStyle w:val="Heading1"/>
+      </w:pPr>
+      <w:r>
         <w:t>Section 1: Cryptocurrency Data</w:t>
       </w:r>
     </w:p>
     <w:p>
       <w:r>
-        <w:t>This section presents Bitcoin price trends over the last 10 days fetched in real-time from CoinGecko API.</w:t>
+        <w:t>Bitcoin price trends over the last 10 days.</w:t>
       </w:r>
     </w:p>
     <w:p>
@@ -113,10 +295,10 @@
     </w:p>
     <w:p>
       <w:pPr>
-        <w:pStyle w:val="Heading1"/>
+        <w:pStyle w:val="Heading2"/>
       </w:pPr>
       <w:r>
-        <w:t>Section 2: Latest Prices (last 10)</w:t>
+        <w:t>Latest Prices (last 10)</w:t>
       </w:r>
     </w:p>
     <w:tbl>
@@ -147,28 +329,6 @@
           <w:p>
             <w:r>
               <w:t>Price (USD)</w:t>
-            </w:r>
-          </w:p>
-        </w:tc>
-      </w:tr>
-      <w:tr>
-        <w:tc>
-          <w:tcPr>
-            <w:tcW w:type="dxa" w:w="4320"/>
-          </w:tcPr>
-          <w:p>
-            <w:r>
-              <w:t>02-20 06</w:t>
-            </w:r>
-          </w:p>
-        </w:tc>
-        <w:tc>
-          <w:tcPr>
-            <w:tcW w:type="dxa" w:w="4320"/>
-          </w:tcPr>
-          <w:p>
-            <w:r>
-              <w:t>67,334.83</w:t>
             </w:r>
           </w:p>
         </w:tc>
@@ -366,7 +526,29 @@
           </w:tcPr>
           <w:p>
             <w:r>
-              <w:t>67,191.55</w:t>
+              <w:t>67,502.26</w:t>
+            </w:r>
+          </w:p>
+        </w:tc>
+      </w:tr>
+      <w:tr>
+        <w:tc>
+          <w:tcPr>
+            <w:tcW w:type="dxa" w:w="4320"/>
+          </w:tcPr>
+          <w:p>
+            <w:r>
+              <w:t>02-20 15</w:t>
+            </w:r>
+          </w:p>
+        </w:tc>
+        <w:tc>
+          <w:tcPr>
+            <w:tcW w:type="dxa" w:w="4320"/>
+          </w:tcPr>
+          <w:p>
+            <w:r>
+              <w:t>66,695.71</w:t>
             </w:r>
           </w:p>
         </w:tc>
@@ -378,7 +560,7 @@
         <w:jc w:val="center"/>
       </w:pPr>
       <w:r>
-        <w:t>Table 1: Last 10 Bitcoin prices (USD).</w:t>
+        <w:t>Table 2: Last 10 Bitcoin prices.</w:t>
       </w:r>
     </w:p>
     <w:sectPr>

</xml_diff>

<commit_message>
Created provision for synthetic data (in excel format)
</commit_message>
<xml_diff>
--- a/reports/dynamic_report.docx
+++ b/reports/dynamic_report.docx
@@ -12,7 +12,7 @@
     </w:p>
     <w:p>
       <w:r>
-        <w:t>Generated on: 2026-02-20 15:49:10</w:t>
+        <w:t>Generated on: 2026-02-20 16:03:45</w:t>
       </w:r>
     </w:p>
     <w:p>
@@ -68,7 +68,7 @@
     </w:p>
     <w:p>
       <w:r>
-        <w:t>This section contains the document versioning log, captured from github. All entries are up to date.</w:t>
+        <w:t>This section contains the document versioning log captured from GitHub. All entries are current and complete as of the report generation date: 2026-02-20 16:03:45.</w:t>
       </w:r>
     </w:p>
     <w:p>
@@ -86,25 +86,14 @@
         <w:tblLook w:firstColumn="1" w:firstRow="1" w:lastColumn="0" w:lastRow="0" w:noHBand="0" w:noVBand="1" w:val="04A0"/>
       </w:tblPr>
       <w:tblGrid>
-        <w:gridCol w:w="2160"/>
-        <w:gridCol w:w="2160"/>
-        <w:gridCol w:w="2160"/>
-        <w:gridCol w:w="2160"/>
+        <w:gridCol w:w="2880"/>
+        <w:gridCol w:w="2880"/>
+        <w:gridCol w:w="2880"/>
       </w:tblGrid>
       <w:tr>
         <w:tc>
           <w:tcPr>
-            <w:tcW w:type="dxa" w:w="2160"/>
-          </w:tcPr>
-          <w:p>
-            <w:r>
-              <w:t>Commit Hash</w:t>
-            </w:r>
-          </w:p>
-        </w:tc>
-        <w:tc>
-          <w:tcPr>
-            <w:tcW w:type="dxa" w:w="2160"/>
+            <w:tcW w:type="dxa" w:w="2880"/>
           </w:tcPr>
           <w:p>
             <w:r>
@@ -114,7 +103,7 @@
         </w:tc>
         <w:tc>
           <w:tcPr>
-            <w:tcW w:type="dxa" w:w="2160"/>
+            <w:tcW w:type="dxa" w:w="2880"/>
           </w:tcPr>
           <w:p>
             <w:r>
@@ -124,7 +113,7 @@
         </w:tc>
         <w:tc>
           <w:tcPr>
-            <w:tcW w:type="dxa" w:w="2160"/>
+            <w:tcW w:type="dxa" w:w="2880"/>
           </w:tcPr>
           <w:p>
             <w:r>
@@ -136,17 +125,7 @@
       <w:tr>
         <w:tc>
           <w:tcPr>
-            <w:tcW w:type="dxa" w:w="2160"/>
-          </w:tcPr>
-          <w:p>
-            <w:r>
-              <w:t>017cc1f</w:t>
-            </w:r>
-          </w:p>
-        </w:tc>
-        <w:tc>
-          <w:tcPr>
-            <w:tcW w:type="dxa" w:w="2160"/>
+            <w:tcW w:type="dxa" w:w="2880"/>
           </w:tcPr>
           <w:p>
             <w:r>
@@ -156,7 +135,39 @@
         </w:tc>
         <w:tc>
           <w:tcPr>
-            <w:tcW w:type="dxa" w:w="2160"/>
+            <w:tcW w:type="dxa" w:w="2880"/>
+          </w:tcPr>
+          <w:p>
+            <w:r>
+              <w:t>Fri Feb 20 15:50:23 2026 +0200</w:t>
+            </w:r>
+          </w:p>
+        </w:tc>
+        <w:tc>
+          <w:tcPr>
+            <w:tcW w:type="dxa" w:w="2880"/>
+          </w:tcPr>
+          <w:p>
+            <w:r>
+              <w:t>Adding formatted git log on main page, as table, including the possibility of controlling to restrict to the last N logs.</w:t>
+            </w:r>
+          </w:p>
+        </w:tc>
+      </w:tr>
+      <w:tr>
+        <w:tc>
+          <w:tcPr>
+            <w:tcW w:type="dxa" w:w="2880"/>
+          </w:tcPr>
+          <w:p>
+            <w:r>
+              <w:t>Marco Miani</w:t>
+            </w:r>
+          </w:p>
+        </w:tc>
+        <w:tc>
+          <w:tcPr>
+            <w:tcW w:type="dxa" w:w="2880"/>
           </w:tcPr>
           <w:p>
             <w:r>
@@ -166,7 +177,7 @@
         </w:tc>
         <w:tc>
           <w:tcPr>
-            <w:tcW w:type="dxa" w:w="2160"/>
+            <w:tcW w:type="dxa" w:w="2880"/>
           </w:tcPr>
           <w:p>
             <w:r>
@@ -178,17 +189,7 @@
       <w:tr>
         <w:tc>
           <w:tcPr>
-            <w:tcW w:type="dxa" w:w="2160"/>
-          </w:tcPr>
-          <w:p>
-            <w:r>
-              <w:t>cae1622</w:t>
-            </w:r>
-          </w:p>
-        </w:tc>
-        <w:tc>
-          <w:tcPr>
-            <w:tcW w:type="dxa" w:w="2160"/>
+            <w:tcW w:type="dxa" w:w="2880"/>
           </w:tcPr>
           <w:p>
             <w:r>
@@ -198,7 +199,7 @@
         </w:tc>
         <w:tc>
           <w:tcPr>
-            <w:tcW w:type="dxa" w:w="2160"/>
+            <w:tcW w:type="dxa" w:w="2880"/>
           </w:tcPr>
           <w:p>
             <w:r>
@@ -208,7 +209,7 @@
         </w:tc>
         <w:tc>
           <w:tcPr>
-            <w:tcW w:type="dxa" w:w="2160"/>
+            <w:tcW w:type="dxa" w:w="2880"/>
           </w:tcPr>
           <w:p>
             <w:r>
@@ -261,7 +262,7 @@
               <a:graphicData uri="http://schemas.openxmlformats.org/drawingml/2006/picture">
                 <pic:pic>
                   <pic:nvPicPr>
-                    <pic:cNvPr id="0" name="temp_plot.png"/>
+                    <pic:cNvPr id="0" name="bitcoin_last10.png"/>
                     <pic:cNvPicPr/>
                   </pic:nvPicPr>
                   <pic:blipFill>
@@ -538,7 +539,7 @@
           </w:tcPr>
           <w:p>
             <w:r>
-              <w:t>02-20 15</w:t>
+              <w:t>02-20 16</w:t>
             </w:r>
           </w:p>
         </w:tc>
@@ -548,7 +549,7 @@
           </w:tcPr>
           <w:p>
             <w:r>
-              <w:t>66,695.71</w:t>
+              <w:t>66,829.52</w:t>
             </w:r>
           </w:p>
         </w:tc>

</xml_diff>

<commit_message>
Added conda env file and README.md
</commit_message>
<xml_diff>
--- a/reports/dynamic_report.docx
+++ b/reports/dynamic_report.docx
@@ -12,7 +12,7 @@
     </w:p>
     <w:p>
       <w:r>
-        <w:t>Generated on: 2026-02-20 16:03:45</w:t>
+        <w:t>Generated on: 2026-02-20 16:33:31</w:t>
       </w:r>
     </w:p>
     <w:p>
@@ -68,7 +68,7 @@
     </w:p>
     <w:p>
       <w:r>
-        <w:t>This section contains the document versioning log captured from GitHub. All entries are current and complete as of the report generation date: 2026-02-20 16:03:45.</w:t>
+        <w:t>This section contains the document versioning log captured from GitHub. All entries are current and complete as of the report generation date: 2026-02-20 16:33:31.</w:t>
       </w:r>
     </w:p>
     <w:p>
@@ -118,6 +118,102 @@
           <w:p>
             <w:r>
               <w:t>Message</w:t>
+            </w:r>
+          </w:p>
+        </w:tc>
+      </w:tr>
+      <w:tr>
+        <w:tc>
+          <w:tcPr>
+            <w:tcW w:type="dxa" w:w="2880"/>
+          </w:tcPr>
+          <w:p>
+            <w:r>
+              <w:t>Marco Miani</w:t>
+            </w:r>
+          </w:p>
+        </w:tc>
+        <w:tc>
+          <w:tcPr>
+            <w:tcW w:type="dxa" w:w="2880"/>
+          </w:tcPr>
+          <w:p>
+            <w:r>
+              <w:t>Fri Feb 20 16:24:45 2026 +0200</w:t>
+            </w:r>
+          </w:p>
+        </w:tc>
+        <w:tc>
+          <w:tcPr>
+            <w:tcW w:type="dxa" w:w="2880"/>
+          </w:tcPr>
+          <w:p>
+            <w:r>
+              <w:t>Improved/Expanded comments in code</w:t>
+            </w:r>
+          </w:p>
+        </w:tc>
+      </w:tr>
+      <w:tr>
+        <w:tc>
+          <w:tcPr>
+            <w:tcW w:type="dxa" w:w="2880"/>
+          </w:tcPr>
+          <w:p>
+            <w:r>
+              <w:t>Marco Miani</w:t>
+            </w:r>
+          </w:p>
+        </w:tc>
+        <w:tc>
+          <w:tcPr>
+            <w:tcW w:type="dxa" w:w="2880"/>
+          </w:tcPr>
+          <w:p>
+            <w:r>
+              <w:t>Fri Feb 20 16:22:10 2026 +0200</w:t>
+            </w:r>
+          </w:p>
+        </w:tc>
+        <w:tc>
+          <w:tcPr>
+            <w:tcW w:type="dxa" w:w="2880"/>
+          </w:tcPr>
+          <w:p>
+            <w:r>
+              <w:t>Added .utils folder containing random file generator</w:t>
+            </w:r>
+          </w:p>
+        </w:tc>
+      </w:tr>
+      <w:tr>
+        <w:tc>
+          <w:tcPr>
+            <w:tcW w:type="dxa" w:w="2880"/>
+          </w:tcPr>
+          <w:p>
+            <w:r>
+              <w:t>Marco Miani</w:t>
+            </w:r>
+          </w:p>
+        </w:tc>
+        <w:tc>
+          <w:tcPr>
+            <w:tcW w:type="dxa" w:w="2880"/>
+          </w:tcPr>
+          <w:p>
+            <w:r>
+              <w:t>Fri Feb 20 16:13:34 2026 +0200</w:t>
+            </w:r>
+          </w:p>
+        </w:tc>
+        <w:tc>
+          <w:tcPr>
+            <w:tcW w:type="dxa" w:w="2880"/>
+          </w:tcPr>
+          <w:p>
+            <w:r>
+              <w:t>Created provision for synthetic data (in excel format)</w:t>
             </w:r>
           </w:p>
         </w:tc>
@@ -341,28 +437,6 @@
           </w:tcPr>
           <w:p>
             <w:r>
-              <w:t>02-20 07</w:t>
-            </w:r>
-          </w:p>
-        </w:tc>
-        <w:tc>
-          <w:tcPr>
-            <w:tcW w:type="dxa" w:w="4320"/>
-          </w:tcPr>
-          <w:p>
-            <w:r>
-              <w:t>67,232.69</w:t>
-            </w:r>
-          </w:p>
-        </w:tc>
-      </w:tr>
-      <w:tr>
-        <w:tc>
-          <w:tcPr>
-            <w:tcW w:type="dxa" w:w="4320"/>
-          </w:tcPr>
-          <w:p>
-            <w:r>
               <w:t>02-20 08</w:t>
             </w:r>
           </w:p>
@@ -549,7 +623,29 @@
           </w:tcPr>
           <w:p>
             <w:r>
-              <w:t>66,829.52</w:t>
+              <w:t>66,754.64</w:t>
+            </w:r>
+          </w:p>
+        </w:tc>
+      </w:tr>
+      <w:tr>
+        <w:tc>
+          <w:tcPr>
+            <w:tcW w:type="dxa" w:w="4320"/>
+          </w:tcPr>
+          <w:p>
+            <w:r>
+              <w:t>02-20 16</w:t>
+            </w:r>
+          </w:p>
+        </w:tc>
+        <w:tc>
+          <w:tcPr>
+            <w:tcW w:type="dxa" w:w="4320"/>
+          </w:tcPr>
+          <w:p>
+            <w:r>
+              <w:t>67,055.07</w:t>
             </w:r>
           </w:p>
         </w:tc>
@@ -562,6 +658,218 @@
       </w:pPr>
       <w:r>
         <w:t>Table 2: Last 10 Bitcoin prices.</w:t>
+      </w:r>
+    </w:p>
+    <w:p>
+      <w:r>
+        <w:br w:type="page"/>
+      </w:r>
+    </w:p>
+    <w:p>
+      <w:pPr>
+        <w:pStyle w:val="Heading1"/>
+      </w:pPr>
+      <w:r>
+        <w:t>Synthetic Experiment 1</w:t>
+      </w:r>
+    </w:p>
+    <w:p>
+      <w:pPr>
+        <w:jc w:val="center"/>
+      </w:pPr>
+      <w:r>
+        <w:drawing>
+          <wp:inline xmlns:a="http://schemas.openxmlformats.org/drawingml/2006/main" xmlns:pic="http://schemas.openxmlformats.org/drawingml/2006/picture">
+            <wp:extent cx="5486400" cy="2743200"/>
+            <wp:docPr id="2" name="Picture 2"/>
+            <wp:cNvGraphicFramePr>
+              <a:graphicFrameLocks noChangeAspect="1"/>
+            </wp:cNvGraphicFramePr>
+            <a:graphic>
+              <a:graphicData uri="http://schemas.openxmlformats.org/drawingml/2006/picture">
+                <pic:pic>
+                  <pic:nvPicPr>
+                    <pic:cNvPr id="0" name="experiment1_run_01.png"/>
+                    <pic:cNvPicPr/>
+                  </pic:nvPicPr>
+                  <pic:blipFill>
+                    <a:blip r:embed="rId10"/>
+                    <a:stretch>
+                      <a:fillRect/>
+                    </a:stretch>
+                  </pic:blipFill>
+                  <pic:spPr>
+                    <a:xfrm>
+                      <a:off x="0" y="0"/>
+                      <a:ext cx="5486400" cy="2743200"/>
+                    </a:xfrm>
+                    <a:prstGeom prst="rect"/>
+                  </pic:spPr>
+                </pic:pic>
+              </a:graphicData>
+            </a:graphic>
+          </wp:inline>
+        </w:drawing>
+      </w:r>
+    </w:p>
+    <w:p>
+      <w:pPr>
+        <w:pStyle w:val="Caption"/>
+        <w:jc w:val="center"/>
+      </w:pPr>
+      <w:r>
+        <w:t>Figure 2: Signals from experiment1_run_01.xlsx</w:t>
+      </w:r>
+    </w:p>
+    <w:p>
+      <w:pPr>
+        <w:jc w:val="left"/>
+      </w:pPr>
+      <w:r>
+        <w:t>Experiment 1: Data illustrates the upper and lower signal bounds clearly. This description corresponds to the dataset 'experiment1_run_01.xlsx'.</w:t>
+      </w:r>
+    </w:p>
+    <w:p>
+      <w:r>
+        <w:br w:type="page"/>
+      </w:r>
+    </w:p>
+    <w:p>
+      <w:pPr>
+        <w:pStyle w:val="Heading1"/>
+      </w:pPr>
+      <w:r>
+        <w:t>Synthetic Experiment 2</w:t>
+      </w:r>
+    </w:p>
+    <w:p>
+      <w:pPr>
+        <w:jc w:val="center"/>
+      </w:pPr>
+      <w:r>
+        <w:drawing>
+          <wp:inline xmlns:a="http://schemas.openxmlformats.org/drawingml/2006/main" xmlns:pic="http://schemas.openxmlformats.org/drawingml/2006/picture">
+            <wp:extent cx="5486400" cy="2743200"/>
+            <wp:docPr id="3" name="Picture 3"/>
+            <wp:cNvGraphicFramePr>
+              <a:graphicFrameLocks noChangeAspect="1"/>
+            </wp:cNvGraphicFramePr>
+            <a:graphic>
+              <a:graphicData uri="http://schemas.openxmlformats.org/drawingml/2006/picture">
+                <pic:pic>
+                  <pic:nvPicPr>
+                    <pic:cNvPr id="0" name="experiment1_run_02.png"/>
+                    <pic:cNvPicPr/>
+                  </pic:nvPicPr>
+                  <pic:blipFill>
+                    <a:blip r:embed="rId11"/>
+                    <a:stretch>
+                      <a:fillRect/>
+                    </a:stretch>
+                  </pic:blipFill>
+                  <pic:spPr>
+                    <a:xfrm>
+                      <a:off x="0" y="0"/>
+                      <a:ext cx="5486400" cy="2743200"/>
+                    </a:xfrm>
+                    <a:prstGeom prst="rect"/>
+                  </pic:spPr>
+                </pic:pic>
+              </a:graphicData>
+            </a:graphic>
+          </wp:inline>
+        </w:drawing>
+      </w:r>
+    </w:p>
+    <w:p>
+      <w:pPr>
+        <w:pStyle w:val="Caption"/>
+        <w:jc w:val="center"/>
+      </w:pPr>
+      <w:r>
+        <w:t>Figure 3: Signals from experiment1_run_02.xlsx</w:t>
+      </w:r>
+    </w:p>
+    <w:p>
+      <w:pPr>
+        <w:jc w:val="left"/>
+      </w:pPr>
+      <w:r>
+        <w:t>Experiment 2: Data illustrates the upper and lower signal bounds clearly. This description corresponds to the dataset 'experiment1_run_02.xlsx'.</w:t>
+      </w:r>
+    </w:p>
+    <w:p>
+      <w:r>
+        <w:br w:type="page"/>
+      </w:r>
+    </w:p>
+    <w:p>
+      <w:pPr>
+        <w:pStyle w:val="Heading1"/>
+      </w:pPr>
+      <w:r>
+        <w:t>Synthetic Experiment 3</w:t>
+      </w:r>
+    </w:p>
+    <w:p>
+      <w:pPr>
+        <w:jc w:val="center"/>
+      </w:pPr>
+      <w:r>
+        <w:drawing>
+          <wp:inline xmlns:a="http://schemas.openxmlformats.org/drawingml/2006/main" xmlns:pic="http://schemas.openxmlformats.org/drawingml/2006/picture">
+            <wp:extent cx="5486400" cy="2743200"/>
+            <wp:docPr id="4" name="Picture 4"/>
+            <wp:cNvGraphicFramePr>
+              <a:graphicFrameLocks noChangeAspect="1"/>
+            </wp:cNvGraphicFramePr>
+            <a:graphic>
+              <a:graphicData uri="http://schemas.openxmlformats.org/drawingml/2006/picture">
+                <pic:pic>
+                  <pic:nvPicPr>
+                    <pic:cNvPr id="0" name="experiment1_run_03.png"/>
+                    <pic:cNvPicPr/>
+                  </pic:nvPicPr>
+                  <pic:blipFill>
+                    <a:blip r:embed="rId12"/>
+                    <a:stretch>
+                      <a:fillRect/>
+                    </a:stretch>
+                  </pic:blipFill>
+                  <pic:spPr>
+                    <a:xfrm>
+                      <a:off x="0" y="0"/>
+                      <a:ext cx="5486400" cy="2743200"/>
+                    </a:xfrm>
+                    <a:prstGeom prst="rect"/>
+                  </pic:spPr>
+                </pic:pic>
+              </a:graphicData>
+            </a:graphic>
+          </wp:inline>
+        </w:drawing>
+      </w:r>
+    </w:p>
+    <w:p>
+      <w:pPr>
+        <w:pStyle w:val="Caption"/>
+        <w:jc w:val="center"/>
+      </w:pPr>
+      <w:r>
+        <w:t>Figure 4: Signals from experiment1_run_03.xlsx</w:t>
+      </w:r>
+    </w:p>
+    <w:p>
+      <w:pPr>
+        <w:jc w:val="left"/>
+      </w:pPr>
+      <w:r>
+        <w:t>Experiment 3: The signal shows expected behavior under simulated conditions. This description corresponds to the dataset 'experiment1_run_03.xlsx'.</w:t>
+      </w:r>
+    </w:p>
+    <w:p>
+      <w:r>
+        <w:br w:type="page"/>
       </w:r>
     </w:p>
     <w:sectPr>

</xml_diff>